<commit_message>
Reframe model-testing examples as representative sample + PoC offer
Closes the transparency gap: replaces "illustrative sample data, not a
live scan" with "representative sample" framing and adds a "Validating
this live (PoC)" section offering a real sanitized scan against the
customer's own endpoints.

Co-Authored-By: Claude Opus 4.8 <noreply@anthropic.com>
Claude-Session: https://claude.ai/code/session_018Bd3zCpvDS4qMq8dvZm8Fs
</commit_message>
<xml_diff>
--- a/examples/AI-Testing-and-Validation-Capabilities.docx
+++ b/examples/AI-Testing-and-Validation-Capabilities.docx
@@ -447,7 +447,7 @@
           <w:color w:val="555555"/>
           <w:sz w:val="18"/>
         </w:rPr>
-        <w:t>Note: the figures below are illustrative sample data generated through the product's real report engine to demonstrate output format — not a live scan.</w:t>
+        <w:t>Note: the figures below are a representative sample, generated through the product's real report engine to show the exact output format. A live scan against your own endpoints — producing these same artifacts with real responses — can be demonstrated during a Proof of Concept.</w:t>
       </w:r>
     </w:p>
     <w:tbl>
@@ -995,6 +995,83 @@
     </w:p>
     <w:p>
       <w:pPr>
+        <w:spacing w:after="160"/>
+      </w:pPr>
+      <w:r>
+        <w:rPr>
+          <w:i w:val="0"/>
+          <w:sz w:val="21"/>
+        </w:rPr>
+        <w:t>Every run produces both a machine-readable JSON report (full payloads, responses, judge reasoning, confidence, policy used, ideal response) and a human-readable Markdown report, plus a live dashboard with score and category breakdown.</w:t>
+      </w:r>
+    </w:p>
+    <w:p>
+      <w:pPr>
+        <w:pStyle w:val="Heading2"/>
+      </w:pPr>
+      <w:r>
+        <w:rPr>
+          <w:color w:val="2B6CB0"/>
+        </w:rPr>
+        <w:t>1.5 Validating this live (PoC)</w:t>
+      </w:r>
+    </w:p>
+    <w:p>
+      <w:pPr>
+        <w:spacing w:after="80"/>
+      </w:pPr>
+      <w:r>
+        <w:rPr>
+          <w:i w:val="0"/>
+          <w:sz w:val="21"/>
+        </w:rPr>
+        <w:t>The sample above uses the production report engine, so a live scan against your real endpoints produces these exact artifacts with genuine model responses. During a Proof of Concept we can, in a single session:</w:t>
+      </w:r>
+    </w:p>
+    <w:p>
+      <w:pPr>
+        <w:pStyle w:val="ListBullet"/>
+      </w:pPr>
+      <w:r>
+        <w:rPr>
+          <w:b/>
+        </w:rPr>
+        <w:t xml:space="preserve">Run live — </w:t>
+      </w:r>
+      <w:r>
+        <w:t>point the same config at one or more of your model endpoints (Qwen, GPT, DeepSeek, GLM, or your own gateway);</w:t>
+      </w:r>
+    </w:p>
+    <w:p>
+      <w:pPr>
+        <w:pStyle w:val="ListBullet"/>
+      </w:pPr>
+      <w:r>
+        <w:rPr>
+          <w:b/>
+        </w:rPr>
+        <w:t xml:space="preserve">Sanitized evidence — </w:t>
+      </w:r>
+      <w:r>
+        <w:t>share the resulting JSON + Markdown reports and dashboard, with sensitive values redacted, as real test evidence;</w:t>
+      </w:r>
+    </w:p>
+    <w:p>
+      <w:pPr>
+        <w:pStyle w:val="ListBullet"/>
+      </w:pPr>
+      <w:r>
+        <w:rPr>
+          <w:b/>
+        </w:rPr>
+        <w:t xml:space="preserve">Reproduce — </w:t>
+      </w:r>
+      <w:r>
+        <w:t>rerun any finding on demand to confirm reproducibility and verify a fix.</w:t>
+      </w:r>
+    </w:p>
+    <w:p>
+      <w:pPr>
         <w:spacing w:after="200"/>
       </w:pPr>
       <w:r>
@@ -1002,7 +1079,7 @@
           <w:i w:val="0"/>
           <w:sz w:val="21"/>
         </w:rPr>
-        <w:t>Every run produces both a machine-readable JSON report (full payloads, responses, judge reasoning, confidence, policy used, ideal response) and a human-readable Markdown report, plus a live dashboard with score and category breakdown.</w:t>
+        <w:t>No code changes are required to switch targets — only the configuration file.</w:t>
       </w:r>
     </w:p>
     <w:p>

</xml_diff>